<commit_message>
Replace the python-net sample input.docx author with a placeholder name and regenerate the outputs that show it
</commit_message>
<xml_diff>
--- a/python-net/_output_files/developer-guide/advanced-usage/adding-metadata/adding_metadata/output.docx
+++ b/python-net/_output_files/developer-guide/advanced-usage/adding-metadata/adding_metadata/output.docx
@@ -1,7 +1,7 @@
 
 <file path=word/document.xml><?xml version="1.0" encoding="utf-8"?>
 <w:document xmlns:ve="http://schemas.openxmlformats.org/markup-compatibility/2006" xmlns:o="urn:schemas-microsoft-com:office:office" xmlns:r="http://schemas.openxmlformats.org/officeDocument/2006/relationships" xmlns:m="http://schemas.openxmlformats.org/officeDocument/2006/math" xmlns:v="urn:schemas-microsoft-com:vml" xmlns:wp="http://schemas.openxmlformats.org/drawingml/2006/wordprocessingDrawing" xmlns:w10="urn:schemas-microsoft-com:office:word" xmlns:w="http://schemas.openxmlformats.org/wordprocessingml/2006/main" xmlns:wne="http://schemas.microsoft.com/office/word/2006/wordml">
-  <!-- Generated by Aspose.Words for .NET 26.4.0 -->
+  <!-- Generated by Aspose.Words for .NET 26.8.0 -->
   <w:body>
     <w:p>
       <w:pPr>
@@ -50,7 +50,7 @@
             <w:rPr>
               <w:lang w:val="uk-UA"/>
             </w:rPr>
-            <w:t>Prokofjev</w:t>
+            <w:t>Emily</w:t>
           </w:r>
           <w:r>
             <w:rPr>
@@ -62,7 +62,7 @@
             <w:rPr>
               <w:lang w:val="uk-UA"/>
             </w:rPr>
-            <w:t>Igor</w:t>
+            <w:t>Carter</w:t>
           </w:r>
         </w:p>
       </w:sdtContent>
@@ -148,7 +148,7 @@
 
 <file path=word/comments.xml><?xml version="1.0" encoding="utf-8"?>
 <w:comments xmlns:ve="http://schemas.openxmlformats.org/markup-compatibility/2006" xmlns:o="urn:schemas-microsoft-com:office:office" xmlns:r="http://schemas.openxmlformats.org/officeDocument/2006/relationships" xmlns:m="http://schemas.openxmlformats.org/officeDocument/2006/math" xmlns:v="urn:schemas-microsoft-com:vml" xmlns:wp="http://schemas.openxmlformats.org/drawingml/2006/wordprocessingDrawing" xmlns:w10="urn:schemas-microsoft-com:office:word" xmlns:w="http://schemas.openxmlformats.org/wordprocessingml/2006/main" xmlns:wne="http://schemas.microsoft.com/office/word/2006/wordml">
-  <w:comment w:id="0" w:author="Prokofjev Igor" w:date="2016-03-22T20:11:00Z" w:initials="PI">
+  <w:comment w:id="0" w:author="Emily Carter" w:date="2016-03-22T20:11:00Z" w:initials="EC">
     <w:p>
       <w:pPr>
         <w:pStyle w:val="CommentText"/>

</xml_diff>